<commit_message>
Add batch 2 (topics 11-20), fix gelatin temperature in topic 8, add report
</commit_message>
<xml_diff>
--- a/Мавзу2/008.docx
+++ b/Мавзу2/008.docx
@@ -225,7 +225,7 @@
           <w:b w:val="0"/>
           <w:sz w:val="28"/>
         </w:rPr>
-        <w:t>Agar dengiz suvo'tlaridan olinadigan polisaxarid bo'lib, bakteriyalar uni deyarli parchalamaydi; u 100 °C ga yaqin haroratda eriydi va taxminan 40 °C gacha sovitilganda qotadi. Agarni bakteriologiyaga F. Gesse kiritgan [3]. Jelatin esa taxminan 25 °C dan yuqori haroratda suyuqlanadi va proteolitik bakteriyalar uni parchalaydi, shu sababli 37 °C da o'stirishga yaramaydi.</w:t>
+        <w:t>Agar dengiz suvo'tlaridan olinadigan polisaxarid bo'lib, bakteriyalar uni deyarli parchalamaydi; u 100 °C ga yaqin haroratda eriydi va taxminan 40 °C gacha sovitilganda qotadi. Agarni bakteriologiyaga F. Gesse kiritgan [3]. Jelatin esa 28 °C va undan yuqori haroratda o'zi suyuqlanadi, proteolitik bakteriyalar uni parchalaydi, shu sababli 37 °C da o'stirishga yaramaydi [7].</w:t>
       </w:r>
     </w:p>
     <w:p>
@@ -622,6 +622,20 @@
         <w:t>[6] Vandepitte J, Engbaek K, Rohner P, Piot P, Heuck CC, et al. Basic laboratory procedures in clinical bacteriology. 2nd ed. Geneva: World Health Organization; 2003. ISBN 92-4-154545-3. https://iris.who.int/handle/10665/42696</w:t>
       </w:r>
     </w:p>
+    <w:p>
+      <w:pPr>
+        <w:spacing w:line="276" w:lineRule="auto"/>
+        <w:jc w:val="left"/>
+      </w:pPr>
+      <w:r>
+        <w:rPr>
+          <w:rFonts w:ascii="Times New Roman" w:hAnsi="Times New Roman" w:eastAsia="Times New Roman"/>
+          <w:b w:val="0"/>
+          <w:sz w:val="24"/>
+        </w:rPr>
+        <w:t>[7] dela Cruz TE. Gelatin hydrolysis test protocol. American Society for Microbiology (ASM Microbe Library); 2012. https://asm.org/asm/media/protocol-images/Gelatin-Hydrolysis-Test-Protocol.pdf</w:t>
+      </w:r>
+    </w:p>
     <w:sectPr>
       <w:pgSz w:w="12240" w:h="15840"/>
       <w:pgMar w:top="1134" w:right="850" w:bottom="1134" w:left="1701" w:header="720" w:footer="720" w:gutter="0"/>

</xml_diff>